<commit_message>
Ajustar estructura financiera: Gobernación 200 millones y Corporación 30 por ciento
Aporte de la Gobernación fijado en $200.000.000 (70 por ciento), que financia
íntegro el componente de litigio estratégico (subcontrato de $78.500.000
incluido), las rutas de protección, los boletines, la incidencia y la red de
defensores. Aporte de la Corporación de $85.714.286 en dinero (30 por ciento
del valor total de $285.714.286), aplicado al sistema de información y a la
investigación del informe. Se conserva el convenio de asociación con
celebración directa (art. 5 del Decreto 092 de 2017) y se documenta la
precisión aritmética del umbral del 30 por ciento sobre el valor total.

Co-Authored-By: Claude Fable 5 <noreply@anthropic.com>
Claude-Session: https://claude.ai/code/session_018oSqTN2fXMjTzKDzYsZsCp
</commit_message>
<xml_diff>
--- a/PROYECTO_DEFINITIVO_OBSERVATORIO.docx
+++ b/PROYECTO_DEFINITIVO_OBSERVATORIO.docx
@@ -170,7 +170,7 @@
               <w:jc w:val="left"/>
             </w:pPr>
             <w:r>
-              <w:t xml:space="preserve">Contrato de interés público, inciso 2 del artículo 355 de la Constitución y artículos 2 a 4 del Decreto 092 de 2017 (numeral 20). Alternativa: convenio de asociación con aporte del 30 % en dinero</w:t>
+              <w:t xml:space="preserve">Convenio de asociación (artículo 96 de la Ley 489 de 1998 y artículo 5 del Decreto 092 de 2017), con celebración directa por aporte de la Corporación no inferior al 30 % del valor total, en dinero (numeral 20)</w:t>
             </w:r>
           </w:p>
         </w:tc>
@@ -222,7 +222,7 @@
               <w:jc w:val="left"/>
             </w:pPr>
             <w:r>
-              <w:t xml:space="preserve">$300.000.000, en dinero, que financian la totalidad del componente de litigio estratégico</w:t>
+              <w:t xml:space="preserve">$200.000.000 (70,0 %), en dinero, que financian la totalidad del componente de litigio estratégico, las rutas de protección, los boletines, la incidencia, la red de defensores y la dirección</w:t>
             </w:r>
           </w:p>
         </w:tc>
@@ -248,33 +248,33 @@
               <w:jc w:val="left"/>
             </w:pPr>
             <w:r>
-              <w:t xml:space="preserve">$19.500.000 en dinero, destinados a gastos menores de facilitación, imprevistos y complemento de los costos de administración, más aporte en especie valorado en $12.000.000 (numeral 20)</w:t>
-            </w:r>
-          </w:p>
-        </w:tc>
-      </w:tr>
-      <w:tr>
-        <w:tc>
-          <w:tcPr/>
-          <w:p>
-            <w:pPr>
-              <w:pStyle w:val="Compact"/>
-              <w:jc w:val="left"/>
-            </w:pPr>
-            <w:r>
-              <w:t xml:space="preserve">Valor total del contrato</w:t>
-            </w:r>
-          </w:p>
-        </w:tc>
-        <w:tc>
-          <w:tcPr/>
-          <w:p>
-            <w:pPr>
-              <w:pStyle w:val="Compact"/>
-              <w:jc w:val="left"/>
-            </w:pPr>
-            <w:r>
-              <w:t xml:space="preserve">$319.500.000 en dinero</w:t>
+              <w:t xml:space="preserve">$85.714.286 (30,0 %), en dinero, que financian el sistema de información y la investigación del informe de dinámicas de violencia, la facilitación de la ejecución y los imprevistos (numeral 20)</w:t>
+            </w:r>
+          </w:p>
+        </w:tc>
+      </w:tr>
+      <w:tr>
+        <w:tc>
+          <w:tcPr/>
+          <w:p>
+            <w:pPr>
+              <w:pStyle w:val="Compact"/>
+              <w:jc w:val="left"/>
+            </w:pPr>
+            <w:r>
+              <w:t xml:space="preserve">Valor total del convenio</w:t>
+            </w:r>
+          </w:p>
+        </w:tc>
+        <w:tc>
+          <w:tcPr/>
+          <w:p>
+            <w:pPr>
+              <w:pStyle w:val="Compact"/>
+              <w:jc w:val="left"/>
+            </w:pPr>
+            <w:r>
+              <w:t xml:space="preserve">$285.714.286, en dinero</w:t>
             </w:r>
           </w:p>
         </w:tc>
@@ -378,7 +378,7 @@
               <w:jc w:val="left"/>
             </w:pPr>
             <w:r>
-              <w:t xml:space="preserve">La Corporación contrata los servicios jurídicos especializados y el litigio estratégico por $80.000.000, financiados con cargo al aporte de la Gobernación (numeral 14)</w:t>
+              <w:t xml:space="preserve">La Corporación contrata los servicios jurídicos especializados y el litigio estratégico por $78.500.000, financiados con cargo al aporte de la Gobernación (numeral 14)</w:t>
             </w:r>
           </w:p>
         </w:tc>
@@ -587,7 +587,7 @@
         <w:pStyle w:val="BodyText"/>
       </w:pPr>
       <w:r>
-        <w:t xml:space="preserve">El hallazgo relevante de la verificación es que el objeto del proyecto corresponde de manera directa a compromisos que el Plan de Desarrollo ya adquirió. Las metas 757 y 758 prevén boletines impresos y digitales «de resultados y análisis de la observación de los hechos victimizantes». Esa correspondencia acredita la primera condición del artículo 2 del Decreto 092 de 2017: el objeto pertenece a los programas del plan de desarrollo, en beneficio de la población defensora. Conviene precisar el encuadre para preservar la segunda condición del mismo artículo: los boletines y el informe son productos del observatorio de la sociedad civil, dirigidos a la población objetivo y al público, y no constituyen una contraprestación a favor del departamento, sin perjuicio de que este pueda reportar los resultados como gestión asociada a sus metas. La red departamental de defensores, por su parte, materializa directamente las metas 749 (instancias locales de derechos humanos en los 40 municipios), 760 (difusión de la ruta departamental), 761 (fortalecimiento de la Mesa Territorial de Garantías) y 764 (formación de líderes).</w:t>
+        <w:t xml:space="preserve">El hallazgo relevante de la verificación es que el objeto del proyecto corresponde de manera directa a compromisos que el Plan de Desarrollo ya adquirió. Las metas 757 y 758 prevén boletines impresos y digitales «de resultados y análisis de la observación de los hechos victimizantes». Esa correspondencia acredita la exigencia del régimen del Decreto 092 de 2017 de que el objeto corresponda a los programas del plan de desarrollo, en beneficio de la población defensora. Conviene precisar el encuadre para preservar la ausencia de relación conmutativa que ese régimen también exige: los boletines y el informe son productos del observatorio de la sociedad civil, dirigidos a la población objetivo y al público, y no constituyen una contraprestación a favor del departamento, sin perjuicio de que este pueda reportar los resultados como gestión asociada a sus metas. La red departamental de defensores, por su parte, materializa directamente las metas 749 (instancias locales de derechos humanos en los 40 municipios), 760 (difusión de la ruta departamental), 761 (fortalecimiento de la Mesa Territorial de Garantías) y 764 (formación de líderes).</w:t>
       </w:r>
     </w:p>
     <w:tbl>
@@ -3234,7 +3234,7 @@
               <w:jc w:val="left"/>
             </w:pPr>
             <w:r>
-              <w:t xml:space="preserve">4</w:t>
+              <w:t xml:space="preserve">3</w:t>
             </w:r>
           </w:p>
         </w:tc>
@@ -3260,7 +3260,7 @@
               <w:jc w:val="left"/>
             </w:pPr>
             <w:r>
-              <w:t xml:space="preserve">4</w:t>
+              <w:t xml:space="preserve">3</w:t>
             </w:r>
           </w:p>
         </w:tc>
@@ -3312,7 +3312,7 @@
               <w:jc w:val="left"/>
             </w:pPr>
             <w:r>
-              <w:t xml:space="preserve">3</w:t>
+              <w:t xml:space="preserve">2</w:t>
             </w:r>
           </w:p>
         </w:tc>
@@ -3341,7 +3341,7 @@
         <w:pStyle w:val="FirstParagraph"/>
       </w:pPr>
       <w:r>
-        <w:t xml:space="preserve">La Corporación contratará la prestación de los servicios jurídicos especializados y el litigio estratégico del proyecto, por un valor de $80.000.000, financiado íntegramente con cargo al aporte de la Gobernación. Es la partida individual de mayor cuantía del proyecto y así se consigna de manera expresa desde la formulación, para que la Gobernación conozca la estructura de ejecución antes de suscribir y no después. Junto con la coordinación jurídica, los abogados de planta, el acompañamiento psicosocial y los gastos directos de litigio, el componente jurídico concentra $124.500.000, el 41,5 % del aporte departamental.</w:t>
+        <w:t xml:space="preserve">La Corporación contratará la prestación de los servicios jurídicos especializados y el litigio estratégico del proyecto, por un valor de $78.500.000, financiado íntegramente con cargo al aporte de la Gobernación. Es la partida individual de mayor cuantía del proyecto y así se consigna de manera expresa desde la formulación, para que la Gobernación conozca la estructura de ejecución antes de suscribir y no después. Junto con la coordinación jurídica, los abogados de planta, el acompañamiento psicosocial y los gastos directos de litigio, el componente jurídico concentra $117.000.000, el 58,5 % del aporte departamental.</w:t>
       </w:r>
     </w:p>
     <w:p>
@@ -3437,7 +3437,7 @@
         <w:pStyle w:val="BodyText"/>
       </w:pPr>
       <w:r>
-        <w:t xml:space="preserve">El subcontrato se financia en su totalidad con recursos del aporte de la Gobernación. La decisión es deliberada y responde a la naturaleza del proyecto: el litigio estratégico es su componente central y su producto de mayor valor público, y corresponde al financiador público asumirlo, del mismo modo que asume el observatorio que le sirve de soporte probatorio. El aporte de la Corporación se destina a los gastos menores de facilitación de la ejecución (alquiler de equipos portátiles cifrados, salas seguras por horas, conectividad y papelería), a los imprevistos y al complemento de los costos de administración, además del aporte en especie de su equipo de investigación al informe de dinámicas de violencia (numeral 20). Esta estructura de financiación determina la modalidad de contratación recomendada, que se sustenta en el numeral 20.</w:t>
+        <w:t xml:space="preserve">El subcontrato se financia en su totalidad con recursos del aporte de la Gobernación. La decisión es deliberada y responde a la naturaleza del proyecto: el litigio estratégico es su componente central y su producto de mayor valor público, y corresponde al financiador público asumirlo. El aporte de la Corporación, no inferior al 30 % del valor total y comprometido en dinero, financia el aparato completo de documentación (el sistema de información y la investigación del informe con su propio equipo), los gastos de facilitación de la ejecución (alquiler de equipos portátiles cifrados, salas seguras por horas, conectividad y papelería) y los imprevistos (numeral 20). Con esa distribución cada parte financia el frente que le es propio: el departamento, la exigencia jurídica de protección; la Corporación, la producción del conocimiento que la sustenta.</w:t>
       </w:r>
     </w:p>
     <w:p>
@@ -3469,7 +3469,7 @@
         <w:pStyle w:val="BodyText"/>
       </w:pPr>
       <w:r>
-        <w:t xml:space="preserve">La Corporación ejecuta directamente la mayoría del valor. El subcontrato representa el 25,0 % del valor total del contrato; el 75,0 % restante se ejecuta bajo la responsabilidad y ejecución directa de la Corporación, que destina $115.250.000 a su equipo propio.</w:t>
+        <w:t xml:space="preserve">La Corporación ejecuta directamente la mayoría del valor. El subcontrato representa el 27,5 % del valor total del convenio; el 72,5 % restante se ejecuta bajo la responsabilidad y ejecución directa de la Corporación, que destina $115.250.000 a su equipo propio.</w:t>
       </w:r>
     </w:p>
     <w:p>
@@ -3894,7 +3894,7 @@
         <w:pStyle w:val="BodyText"/>
       </w:pPr>
       <w:r>
-        <w:t xml:space="preserve">Encuentros subregionales y audiencia de balance. Tres encuentros subregionales (Cúcuta, Ocaña y Pamplona, con participación remota o desplazada de los municipios del Catatumbo según las condiciones de seguridad) y una audiencia departamental de balance en diciembre, en la que la red recibe el informe del observatorio y el estado de las actuaciones jurídicas.</w:t>
+        <w:t xml:space="preserve">Encuentros subregionales y audiencia de balance. Para no duplicar costos, los encuentros subregionales de la red se realizan en las cinco jornadas territoriales de documentación del producto 2, que cumplen doble función, y la audiencia departamental de balance se realiza en la audiencia pública de presentación de resultados del producto 6, en diciembre, en la que la red recibe el informe del observatorio y el estado de las actuaciones jurídicas. La red tiene un acto propio de instalación en Cúcuta.</w:t>
       </w:r>
     </w:p>
     <w:p>
@@ -3992,7 +3992,7 @@
               <w:jc w:val="left"/>
             </w:pPr>
             <w:r>
-              <w:t xml:space="preserve">La institucionalización de la evidencia como base de la política de protección: el observatorio, el índice departamental de riesgo y la serie anual repetible cumplen esa función; se prevé un módulo piloto de percepción de amenaza a liderazgos dentro del informe</w:t>
+              <w:t xml:space="preserve">La institucionalización de la evidencia como base de la política de protección: el observatorio, el índice departamental de riesgo y la serie anual repetible cumplen esa función; el módulo piloto de percepción de amenaza a liderazgos queda previsto como desarrollo de la Fase 2 (numeral 24)</w:t>
             </w:r>
           </w:p>
         </w:tc>
@@ -4327,7 +4327,7 @@
               <w:jc w:val="left"/>
             </w:pPr>
             <w:r>
-              <w:t xml:space="preserve">Gobernación</w:t>
+              <w:t xml:space="preserve">Corporación</w:t>
             </w:r>
           </w:p>
         </w:tc>
@@ -4377,7 +4377,7 @@
               <w:jc w:val="left"/>
             </w:pPr>
             <w:r>
-              <w:t xml:space="preserve">Gobernación</w:t>
+              <w:t xml:space="preserve">Corporación</w:t>
             </w:r>
           </w:p>
         </w:tc>
@@ -4594,7 +4594,7 @@
               <w:jc w:val="left"/>
             </w:pPr>
             <w:r>
-              <w:t xml:space="preserve">Gobernación</w:t>
+              <w:t xml:space="preserve">Corporación</w:t>
             </w:r>
           </w:p>
         </w:tc>
@@ -4644,7 +4644,7 @@
               <w:jc w:val="left"/>
             </w:pPr>
             <w:r>
-              <w:t xml:space="preserve">Gobernación</w:t>
+              <w:t xml:space="preserve">Corporación</w:t>
             </w:r>
           </w:p>
         </w:tc>
@@ -4670,7 +4670,7 @@
               <w:jc w:val="left"/>
             </w:pPr>
             <w:r>
-              <w:t xml:space="preserve">Cinco jornadas de documentación territorial en municipios priorizados</w:t>
+              <w:t xml:space="preserve">Cinco jornadas de documentación territorial en municipios priorizados, que cumplen a la vez la función de encuentros subregionales de la red de defensores (numeral 15)</w:t>
             </w:r>
           </w:p>
         </w:tc>
@@ -4694,7 +4694,7 @@
               <w:jc w:val="left"/>
             </w:pPr>
             <w:r>
-              <w:t xml:space="preserve">Gobernación</w:t>
+              <w:t xml:space="preserve">Corporación</w:t>
             </w:r>
           </w:p>
         </w:tc>
@@ -4744,7 +4744,7 @@
               <w:jc w:val="left"/>
             </w:pPr>
             <w:r>
-              <w:t xml:space="preserve">Gobernación</w:t>
+              <w:t xml:space="preserve">Corporación</w:t>
             </w:r>
           </w:p>
         </w:tc>
@@ -4794,7 +4794,7 @@
               <w:jc w:val="left"/>
             </w:pPr>
             <w:r>
-              <w:t xml:space="preserve">Gobernación</w:t>
+              <w:t xml:space="preserve">Corporación</w:t>
             </w:r>
           </w:p>
         </w:tc>
@@ -4832,7 +4832,7 @@
               <w:jc w:val="left"/>
             </w:pPr>
             <w:r>
-              <w:t xml:space="preserve">$1.500.000</w:t>
+              <w:t xml:space="preserve">$1.250.000</w:t>
             </w:r>
           </w:p>
         </w:tc>
@@ -4855,80 +4855,30 @@
           <w:p>
             <w:pPr>
               <w:pStyle w:val="Compact"/>
-              <w:jc w:val="left"/>
-            </w:pPr>
-            <w:r>
-              <w:t xml:space="preserve">2.7</w:t>
-            </w:r>
-          </w:p>
-        </w:tc>
-        <w:tc>
-          <w:tcPr/>
-          <w:p>
-            <w:pPr>
-              <w:pStyle w:val="Compact"/>
-              <w:jc w:val="left"/>
-            </w:pPr>
-            <w:r>
-              <w:t xml:space="preserve">Dedicación del equipo de investigación de la Corporación al informe de dinámicas de violencia (aporte en especie valorado; no computa en el valor en dinero del contrato)</w:t>
-            </w:r>
-          </w:p>
-        </w:tc>
-        <w:tc>
-          <w:tcPr/>
-          <w:p>
-            <w:pPr>
-              <w:pStyle w:val="Compact"/>
-              <w:jc w:val="left"/>
-            </w:pPr>
-            <w:r>
-              <w:t xml:space="preserve">$12.000.000</w:t>
-            </w:r>
-          </w:p>
-        </w:tc>
-        <w:tc>
-          <w:tcPr/>
-          <w:p>
-            <w:pPr>
-              <w:pStyle w:val="Compact"/>
-              <w:jc w:val="left"/>
-            </w:pPr>
-            <w:r>
-              <w:t xml:space="preserve">Corporación (especie)</w:t>
-            </w:r>
-          </w:p>
-        </w:tc>
-      </w:tr>
-      <w:tr>
-        <w:tc>
-          <w:tcPr/>
-          <w:p>
-            <w:pPr>
-              <w:pStyle w:val="Compact"/>
-            </w:pPr>
-          </w:p>
-        </w:tc>
-        <w:tc>
-          <w:tcPr/>
-          <w:p>
-            <w:pPr>
-              <w:pStyle w:val="Compact"/>
-              <w:jc w:val="left"/>
-            </w:pPr>
-            <w:r>
-              <w:t xml:space="preserve">Subtotal Producto 2 (en dinero)</w:t>
-            </w:r>
-          </w:p>
-        </w:tc>
-        <w:tc>
-          <w:tcPr/>
-          <w:p>
-            <w:pPr>
-              <w:pStyle w:val="Compact"/>
-              <w:jc w:val="left"/>
-            </w:pPr>
-            <w:r>
-              <w:t xml:space="preserve">$49.750.000</w:t>
+            </w:pPr>
+          </w:p>
+        </w:tc>
+        <w:tc>
+          <w:tcPr/>
+          <w:p>
+            <w:pPr>
+              <w:pStyle w:val="Compact"/>
+              <w:jc w:val="left"/>
+            </w:pPr>
+            <w:r>
+              <w:t xml:space="preserve">Subtotal Producto 2</w:t>
+            </w:r>
+          </w:p>
+        </w:tc>
+        <w:tc>
+          <w:tcPr/>
+          <w:p>
+            <w:pPr>
+              <w:pStyle w:val="Compact"/>
+              <w:jc w:val="left"/>
+            </w:pPr>
+            <w:r>
+              <w:t xml:space="preserve">$49.500.000</w:t>
             </w:r>
           </w:p>
         </w:tc>
@@ -5099,7 +5049,7 @@
               <w:jc w:val="left"/>
             </w:pPr>
             <w:r>
-              <w:t xml:space="preserve">$7.500.000</w:t>
+              <w:t xml:space="preserve">$5.500.000</w:t>
             </w:r>
           </w:p>
         </w:tc>
@@ -5145,7 +5095,7 @@
               <w:jc w:val="left"/>
             </w:pPr>
             <w:r>
-              <w:t xml:space="preserve">$18.000.000</w:t>
+              <w:t xml:space="preserve">$16.000.000</w:t>
             </w:r>
           </w:p>
         </w:tc>
@@ -5354,19 +5304,19 @@
               <w:jc w:val="left"/>
             </w:pPr>
             <w:r>
-              <w:t xml:space="preserve">Contratación de servicios jurídicos especializados y litigio estratégico: representación especializada ante la UNP, el CERREM y la Fiscalía en los casos asignados por la coordinación jurídica; peticiones y solicitudes de medidas cautelares ante la CIDH; litigio penal complejo en casos emblemáticos (numeral 14)</w:t>
-            </w:r>
-          </w:p>
-        </w:tc>
-        <w:tc>
-          <w:tcPr/>
-          <w:p>
-            <w:pPr>
-              <w:pStyle w:val="Compact"/>
-              <w:jc w:val="left"/>
-            </w:pPr>
-            <w:r>
-              <w:t xml:space="preserve">$80.000.000</w:t>
+              <w:t xml:space="preserve">Contratación de servicios jurídicos especializados y litigio estratégico: representación especializada ante la UNP, el CERREM y la Fiscalía en los casos asignados por la coordinación jurídica; peticiones y solicitudes de medidas cautelares ante la CIDH; litigio penal complejo en casos emblemáticos (numeral 14; el valor incluye los gastos operativos del litigio)</w:t>
+            </w:r>
+          </w:p>
+        </w:tc>
+        <w:tc>
+          <w:tcPr/>
+          <w:p>
+            <w:pPr>
+              <w:pStyle w:val="Compact"/>
+              <w:jc w:val="left"/>
+            </w:pPr>
+            <w:r>
+              <w:t xml:space="preserve">$78.500.000</w:t>
             </w:r>
           </w:p>
         </w:tc>
@@ -5389,56 +5339,6 @@
           <w:p>
             <w:pPr>
               <w:pStyle w:val="Compact"/>
-              <w:jc w:val="left"/>
-            </w:pPr>
-            <w:r>
-              <w:t xml:space="preserve">4.4</w:t>
-            </w:r>
-          </w:p>
-        </w:tc>
-        <w:tc>
-          <w:tcPr/>
-          <w:p>
-            <w:pPr>
-              <w:pStyle w:val="Compact"/>
-              <w:jc w:val="left"/>
-            </w:pPr>
-            <w:r>
-              <w:t xml:space="preserve">Gastos directos de litigio: autenticaciones, notificaciones internacionales, desplazamientos a diligencias y audiencias, peritajes puntuales</w:t>
-            </w:r>
-          </w:p>
-        </w:tc>
-        <w:tc>
-          <w:tcPr/>
-          <w:p>
-            <w:pPr>
-              <w:pStyle w:val="Compact"/>
-              <w:jc w:val="left"/>
-            </w:pPr>
-            <w:r>
-              <w:t xml:space="preserve">$6.000.000</w:t>
-            </w:r>
-          </w:p>
-        </w:tc>
-        <w:tc>
-          <w:tcPr/>
-          <w:p>
-            <w:pPr>
-              <w:pStyle w:val="Compact"/>
-              <w:jc w:val="left"/>
-            </w:pPr>
-            <w:r>
-              <w:t xml:space="preserve">Gobernación</w:t>
-            </w:r>
-          </w:p>
-        </w:tc>
-      </w:tr>
-      <w:tr>
-        <w:tc>
-          <w:tcPr/>
-          <w:p>
-            <w:pPr>
-              <w:pStyle w:val="Compact"/>
             </w:pPr>
           </w:p>
         </w:tc>
@@ -5462,7 +5362,7 @@
               <w:jc w:val="left"/>
             </w:pPr>
             <w:r>
-              <w:t xml:space="preserve">$109.000.000</w:t>
+              <w:t xml:space="preserve">$101.500.000</w:t>
             </w:r>
           </w:p>
         </w:tc>
@@ -5788,7 +5688,7 @@
               <w:jc w:val="left"/>
             </w:pPr>
             <w:r>
-              <w:t xml:space="preserve">Mesa técnica de validación con las fuentes y audiencia pública de presentación de resultados ante las instancias competentes</w:t>
+              <w:t xml:space="preserve">Mesa técnica de validación con las fuentes y audiencia pública de presentación de resultados, que sirve además de audiencia departamental de balance de la red (numeral 15)</w:t>
             </w:r>
           </w:p>
         </w:tc>
@@ -5955,19 +5855,19 @@
               <w:jc w:val="left"/>
             </w:pPr>
             <w:r>
-              <w:t xml:space="preserve">Tres encuentros subregionales de la red (Cúcuta, Ocaña y Pamplona)</w:t>
-            </w:r>
-          </w:p>
-        </w:tc>
-        <w:tc>
-          <w:tcPr/>
-          <w:p>
-            <w:pPr>
-              <w:pStyle w:val="Compact"/>
-              <w:jc w:val="left"/>
-            </w:pPr>
-            <w:r>
-              <w:t xml:space="preserve">$10.500.000</w:t>
+              <w:t xml:space="preserve">Instalación pública de la red departamental de defensores en Cúcuta</w:t>
+            </w:r>
+          </w:p>
+        </w:tc>
+        <w:tc>
+          <w:tcPr/>
+          <w:p>
+            <w:pPr>
+              <w:pStyle w:val="Compact"/>
+              <w:jc w:val="left"/>
+            </w:pPr>
+            <w:r>
+              <w:t xml:space="preserve">$3.000.000</w:t>
             </w:r>
           </w:p>
         </w:tc>
@@ -6005,19 +5905,19 @@
               <w:jc w:val="left"/>
             </w:pPr>
             <w:r>
-              <w:t xml:space="preserve">Instalación pública de la red y audiencia departamental de balance</w:t>
-            </w:r>
-          </w:p>
-        </w:tc>
-        <w:tc>
-          <w:tcPr/>
-          <w:p>
-            <w:pPr>
-              <w:pStyle w:val="Compact"/>
-              <w:jc w:val="left"/>
-            </w:pPr>
-            <w:r>
-              <w:t xml:space="preserve">$5.000.000</w:t>
+              <w:t xml:space="preserve">Guía de autoprotección adaptada al departamento, impresa y digital</w:t>
+            </w:r>
+          </w:p>
+        </w:tc>
+        <w:tc>
+          <w:tcPr/>
+          <w:p>
+            <w:pPr>
+              <w:pStyle w:val="Compact"/>
+              <w:jc w:val="left"/>
+            </w:pPr>
+            <w:r>
+              <w:t xml:space="preserve">$3.000.000</w:t>
             </w:r>
           </w:p>
         </w:tc>
@@ -6055,19 +5955,19 @@
               <w:jc w:val="left"/>
             </w:pPr>
             <w:r>
-              <w:t xml:space="preserve">Guía de autoprotección adaptada al departamento, impresa y digital</w:t>
-            </w:r>
-          </w:p>
-        </w:tc>
-        <w:tc>
-          <w:tcPr/>
-          <w:p>
-            <w:pPr>
-              <w:pStyle w:val="Compact"/>
-              <w:jc w:val="left"/>
-            </w:pPr>
-            <w:r>
-              <w:t xml:space="preserve">$3.000.000</w:t>
+              <w:t xml:space="preserve">Protocolo de alerta y reacción rápida: formación y canal seguro de comunicaciones</w:t>
+            </w:r>
+          </w:p>
+        </w:tc>
+        <w:tc>
+          <w:tcPr/>
+          <w:p>
+            <w:pPr>
+              <w:pStyle w:val="Compact"/>
+              <w:jc w:val="left"/>
+            </w:pPr>
+            <w:r>
+              <w:t xml:space="preserve">$2.000.000</w:t>
             </w:r>
           </w:p>
         </w:tc>
@@ -6090,56 +5990,6 @@
           <w:p>
             <w:pPr>
               <w:pStyle w:val="Compact"/>
-              <w:jc w:val="left"/>
-            </w:pPr>
-            <w:r>
-              <w:t xml:space="preserve">7.4</w:t>
-            </w:r>
-          </w:p>
-        </w:tc>
-        <w:tc>
-          <w:tcPr/>
-          <w:p>
-            <w:pPr>
-              <w:pStyle w:val="Compact"/>
-              <w:jc w:val="left"/>
-            </w:pPr>
-            <w:r>
-              <w:t xml:space="preserve">Protocolo de alerta y reacción rápida: formación y canal seguro de comunicaciones</w:t>
-            </w:r>
-          </w:p>
-        </w:tc>
-        <w:tc>
-          <w:tcPr/>
-          <w:p>
-            <w:pPr>
-              <w:pStyle w:val="Compact"/>
-              <w:jc w:val="left"/>
-            </w:pPr>
-            <w:r>
-              <w:t xml:space="preserve">$2.000.000</w:t>
-            </w:r>
-          </w:p>
-        </w:tc>
-        <w:tc>
-          <w:tcPr/>
-          <w:p>
-            <w:pPr>
-              <w:pStyle w:val="Compact"/>
-              <w:jc w:val="left"/>
-            </w:pPr>
-            <w:r>
-              <w:t xml:space="preserve">Gobernación</w:t>
-            </w:r>
-          </w:p>
-        </w:tc>
-      </w:tr>
-      <w:tr>
-        <w:tc>
-          <w:tcPr/>
-          <w:p>
-            <w:pPr>
-              <w:pStyle w:val="Compact"/>
             </w:pPr>
           </w:p>
         </w:tc>
@@ -6163,7 +6013,7 @@
               <w:jc w:val="left"/>
             </w:pPr>
             <w:r>
-              <w:t xml:space="preserve">$20.500.000</w:t>
+              <w:t xml:space="preserve">$8.000.000</w:t>
             </w:r>
           </w:p>
         </w:tc>
@@ -6509,7 +6359,7 @@
         <w:pStyle w:val="FirstParagraph"/>
       </w:pPr>
       <w:r>
-        <w:t xml:space="preserve">Aporte de la Gobernación: $300.000.000.</w:t>
+        <w:t xml:space="preserve">Aporte de la Gobernación: $200.000.000, aplicado a los boletines, el componente jurídico, la incidencia, la red de defensores y la dirección del proyecto.</w:t>
       </w:r>
     </w:p>
     <w:tbl>
@@ -6574,82 +6424,6 @@
               <w:jc w:val="left"/>
             </w:pPr>
             <w:r>
-              <w:t xml:space="preserve">Producto 1</w:t>
-            </w:r>
-          </w:p>
-        </w:tc>
-        <w:tc>
-          <w:tcPr/>
-          <w:p>
-            <w:pPr>
-              <w:pStyle w:val="Compact"/>
-              <w:jc w:val="left"/>
-            </w:pPr>
-            <w:r>
-              <w:t xml:space="preserve">4502016 - Servicio de información implementado</w:t>
-            </w:r>
-          </w:p>
-        </w:tc>
-        <w:tc>
-          <w:tcPr/>
-          <w:p>
-            <w:pPr>
-              <w:pStyle w:val="Compact"/>
-              <w:jc w:val="left"/>
-            </w:pPr>
-            <w:r>
-              <w:t xml:space="preserve">$20.000.000</w:t>
-            </w:r>
-          </w:p>
-        </w:tc>
-      </w:tr>
-      <w:tr>
-        <w:tc>
-          <w:tcPr/>
-          <w:p>
-            <w:pPr>
-              <w:pStyle w:val="Compact"/>
-              <w:jc w:val="left"/>
-            </w:pPr>
-            <w:r>
-              <w:t xml:space="preserve">Producto 2</w:t>
-            </w:r>
-          </w:p>
-        </w:tc>
-        <w:tc>
-          <w:tcPr/>
-          <w:p>
-            <w:pPr>
-              <w:pStyle w:val="Compact"/>
-              <w:jc w:val="left"/>
-            </w:pPr>
-            <w:r>
-              <w:t xml:space="preserve">4502030 - Documentos de investigación</w:t>
-            </w:r>
-          </w:p>
-        </w:tc>
-        <w:tc>
-          <w:tcPr/>
-          <w:p>
-            <w:pPr>
-              <w:pStyle w:val="Compact"/>
-              <w:jc w:val="left"/>
-            </w:pPr>
-            <w:r>
-              <w:t xml:space="preserve">$48.250.000</w:t>
-            </w:r>
-          </w:p>
-        </w:tc>
-      </w:tr>
-      <w:tr>
-        <w:tc>
-          <w:tcPr/>
-          <w:p>
-            <w:pPr>
-              <w:pStyle w:val="Compact"/>
-              <w:jc w:val="left"/>
-            </w:pPr>
-            <w:r>
               <w:t xml:space="preserve">Producto 3</w:t>
             </w:r>
           </w:p>
@@ -6674,7 +6448,7 @@
               <w:jc w:val="left"/>
             </w:pPr>
             <w:r>
-              <w:t xml:space="preserve">$18.000.000</w:t>
+              <w:t xml:space="preserve">$16.000.000</w:t>
             </w:r>
           </w:p>
         </w:tc>
@@ -6712,7 +6486,7 @@
               <w:jc w:val="left"/>
             </w:pPr>
             <w:r>
-              <w:t xml:space="preserve">$109.000.000</w:t>
+              <w:t xml:space="preserve">$101.500.000</w:t>
             </w:r>
           </w:p>
         </w:tc>
@@ -6826,7 +6600,7 @@
               <w:jc w:val="left"/>
             </w:pPr>
             <w:r>
-              <w:t xml:space="preserve">$20.500.000</w:t>
+              <w:t xml:space="preserve">$8.000.000</w:t>
             </w:r>
           </w:p>
         </w:tc>
@@ -6898,7 +6672,7 @@
               <w:jc w:val="left"/>
             </w:pPr>
             <w:r>
-              <w:t xml:space="preserve">$262.750.000</w:t>
+              <w:t xml:space="preserve">$172.500.000</w:t>
             </w:r>
           </w:p>
         </w:tc>
@@ -6932,7 +6706,7 @@
               <w:jc w:val="left"/>
             </w:pPr>
             <w:r>
-              <w:t xml:space="preserve">$19.500.000</w:t>
+              <w:t xml:space="preserve">$13.000.000</w:t>
             </w:r>
           </w:p>
         </w:tc>
@@ -6966,41 +6740,41 @@
               <w:jc w:val="left"/>
             </w:pPr>
             <w:r>
-              <w:t xml:space="preserve">$4.000.000</w:t>
-            </w:r>
-          </w:p>
-        </w:tc>
-      </w:tr>
-      <w:tr>
-        <w:tc>
-          <w:tcPr/>
-          <w:p>
-            <w:pPr>
-              <w:pStyle w:val="Compact"/>
-            </w:pPr>
-          </w:p>
-        </w:tc>
-        <w:tc>
-          <w:tcPr/>
-          <w:p>
-            <w:pPr>
-              <w:pStyle w:val="Compact"/>
-              <w:jc w:val="left"/>
-            </w:pPr>
-            <w:r>
-              <w:t xml:space="preserve">Costos indirectos de administración de la Corporación reconocidos por el contrato (4,6 %; el excedente lo asume la Corporación con su aporte)</w:t>
-            </w:r>
-          </w:p>
-        </w:tc>
-        <w:tc>
-          <w:tcPr/>
-          <w:p>
-            <w:pPr>
-              <w:pStyle w:val="Compact"/>
-              <w:jc w:val="left"/>
-            </w:pPr>
-            <w:r>
-              <w:t xml:space="preserve">$13.750.000</w:t>
+              <w:t xml:space="preserve">$3.500.000</w:t>
+            </w:r>
+          </w:p>
+        </w:tc>
+      </w:tr>
+      <w:tr>
+        <w:tc>
+          <w:tcPr/>
+          <w:p>
+            <w:pPr>
+              <w:pStyle w:val="Compact"/>
+            </w:pPr>
+          </w:p>
+        </w:tc>
+        <w:tc>
+          <w:tcPr/>
+          <w:p>
+            <w:pPr>
+              <w:pStyle w:val="Compact"/>
+              <w:jc w:val="left"/>
+            </w:pPr>
+            <w:r>
+              <w:t xml:space="preserve">Costos indirectos de administración de la Corporación reconocidos por el convenio</w:t>
+            </w:r>
+          </w:p>
+        </w:tc>
+        <w:tc>
+          <w:tcPr/>
+          <w:p>
+            <w:pPr>
+              <w:pStyle w:val="Compact"/>
+              <w:jc w:val="left"/>
+            </w:pPr>
+            <w:r>
+              <w:t xml:space="preserve">$11.000.000</w:t>
             </w:r>
           </w:p>
         </w:tc>
@@ -7034,7 +6808,7 @@
               <w:jc w:val="left"/>
             </w:pPr>
             <w:r>
-              <w:t xml:space="preserve">$300.000.000</w:t>
+              <w:t xml:space="preserve">$200.000.000</w:t>
             </w:r>
           </w:p>
         </w:tc>
@@ -7045,7 +6819,7 @@
         <w:pStyle w:val="BodyText"/>
       </w:pPr>
       <w:r>
-        <w:t xml:space="preserve">Aporte de la Corporación: $19.500.000 en dinero, más aporte en especie valorado en $12.000.000.</w:t>
+        <w:t xml:space="preserve">Aporte de la Corporación: $85.714.286 en dinero, aplicado al sistema de información, a la investigación del informe y a la facilitación de la ejecución.</w:t>
       </w:r>
     </w:p>
     <w:tbl>
@@ -7056,8 +6830,9 @@
         <w:jc w:val="start"/>
       </w:tblPr>
       <w:tblGrid>
-        <w:gridCol w:w="3960"/>
-        <w:gridCol w:w="3960"/>
+        <w:gridCol w:w="2640"/>
+        <w:gridCol w:w="2640"/>
+        <w:gridCol w:w="2640"/>
       </w:tblGrid>
       <w:tr>
         <w:trPr>
@@ -7071,6 +6846,18 @@
               <w:jc w:val="left"/>
             </w:pPr>
             <w:r>
+              <w:t xml:space="preserve">Ítem</w:t>
+            </w:r>
+          </w:p>
+        </w:tc>
+        <w:tc>
+          <w:tcPr/>
+          <w:p>
+            <w:pPr>
+              <w:pStyle w:val="Compact"/>
+              <w:jc w:val="left"/>
+            </w:pPr>
+            <w:r>
               <w:t xml:space="preserve">Concepto</w:t>
             </w:r>
           </w:p>
@@ -7097,59 +6884,95 @@
               <w:jc w:val="left"/>
             </w:pPr>
             <w:r>
-              <w:t xml:space="preserve">Alquiler de equipos portátiles cifrados y herramientas de seguridad digital (actividad 1.3)</w:t>
-            </w:r>
-          </w:p>
-        </w:tc>
-        <w:tc>
-          <w:tcPr/>
-          <w:p>
-            <w:pPr>
-              <w:pStyle w:val="Compact"/>
-              <w:jc w:val="left"/>
-            </w:pPr>
-            <w:r>
-              <w:t xml:space="preserve">$8.000.000</w:t>
-            </w:r>
-          </w:p>
-        </w:tc>
-      </w:tr>
-      <w:tr>
-        <w:tc>
-          <w:tcPr/>
-          <w:p>
-            <w:pPr>
-              <w:pStyle w:val="Compact"/>
-              <w:jc w:val="left"/>
-            </w:pPr>
-            <w:r>
-              <w:t xml:space="preserve">Salas seguras para entrevistas confidenciales, por horas (actividad 2.6)</w:t>
-            </w:r>
-          </w:p>
-        </w:tc>
-        <w:tc>
-          <w:tcPr/>
-          <w:p>
-            <w:pPr>
-              <w:pStyle w:val="Compact"/>
-              <w:jc w:val="left"/>
-            </w:pPr>
-            <w:r>
-              <w:t xml:space="preserve">$1.500.000</w:t>
-            </w:r>
-          </w:p>
-        </w:tc>
-      </w:tr>
-      <w:tr>
-        <w:tc>
-          <w:tcPr/>
-          <w:p>
-            <w:pPr>
-              <w:pStyle w:val="Compact"/>
-              <w:jc w:val="left"/>
-            </w:pPr>
-            <w:r>
-              <w:t xml:space="preserve">Conectividad, telefonía segura y papelería (actividad T.4)</w:t>
+              <w:t xml:space="preserve">Producto 1</w:t>
+            </w:r>
+          </w:p>
+        </w:tc>
+        <w:tc>
+          <w:tcPr/>
+          <w:p>
+            <w:pPr>
+              <w:pStyle w:val="Compact"/>
+              <w:jc w:val="left"/>
+            </w:pPr>
+            <w:r>
+              <w:t xml:space="preserve">4502016 - Servicio de información implementado</w:t>
+            </w:r>
+          </w:p>
+        </w:tc>
+        <w:tc>
+          <w:tcPr/>
+          <w:p>
+            <w:pPr>
+              <w:pStyle w:val="Compact"/>
+              <w:jc w:val="left"/>
+            </w:pPr>
+            <w:r>
+              <w:t xml:space="preserve">$28.000.000</w:t>
+            </w:r>
+          </w:p>
+        </w:tc>
+      </w:tr>
+      <w:tr>
+        <w:tc>
+          <w:tcPr/>
+          <w:p>
+            <w:pPr>
+              <w:pStyle w:val="Compact"/>
+              <w:jc w:val="left"/>
+            </w:pPr>
+            <w:r>
+              <w:t xml:space="preserve">Producto 2</w:t>
+            </w:r>
+          </w:p>
+        </w:tc>
+        <w:tc>
+          <w:tcPr/>
+          <w:p>
+            <w:pPr>
+              <w:pStyle w:val="Compact"/>
+              <w:jc w:val="left"/>
+            </w:pPr>
+            <w:r>
+              <w:t xml:space="preserve">4502030 - Documentos de investigación</w:t>
+            </w:r>
+          </w:p>
+        </w:tc>
+        <w:tc>
+          <w:tcPr/>
+          <w:p>
+            <w:pPr>
+              <w:pStyle w:val="Compact"/>
+              <w:jc w:val="left"/>
+            </w:pPr>
+            <w:r>
+              <w:t xml:space="preserve">$49.500.000</w:t>
+            </w:r>
+          </w:p>
+        </w:tc>
+      </w:tr>
+      <w:tr>
+        <w:tc>
+          <w:tcPr/>
+          <w:p>
+            <w:pPr>
+              <w:pStyle w:val="Compact"/>
+              <w:jc w:val="left"/>
+            </w:pPr>
+            <w:r>
+              <w:t xml:space="preserve">Transversal</w:t>
+            </w:r>
+          </w:p>
+        </w:tc>
+        <w:tc>
+          <w:tcPr/>
+          <w:p>
+            <w:pPr>
+              <w:pStyle w:val="Compact"/>
+              <w:jc w:val="left"/>
+            </w:pPr>
+            <w:r>
+              <w:t xml:space="preserve">Facilitación: conectividad, telefonía segura y papelería</w:t>
             </w:r>
           </w:p>
         </w:tc>
@@ -7172,6 +6995,14 @@
           <w:p>
             <w:pPr>
               <w:pStyle w:val="Compact"/>
+            </w:pPr>
+          </w:p>
+        </w:tc>
+        <w:tc>
+          <w:tcPr/>
+          <w:p>
+            <w:pPr>
+              <w:pStyle w:val="Compact"/>
               <w:jc w:val="left"/>
             </w:pPr>
             <w:r>
@@ -7187,111 +7018,75 @@
               <w:jc w:val="left"/>
             </w:pPr>
             <w:r>
-              <w:t xml:space="preserve">$4.500.000</w:t>
-            </w:r>
-          </w:p>
-        </w:tc>
-      </w:tr>
-      <w:tr>
-        <w:tc>
-          <w:tcPr/>
-          <w:p>
-            <w:pPr>
-              <w:pStyle w:val="Compact"/>
-              <w:jc w:val="left"/>
-            </w:pPr>
-            <w:r>
-              <w:t xml:space="preserve">Imprevistos y contingencias del proyecto, asumidos por la Corporación</w:t>
-            </w:r>
-          </w:p>
-        </w:tc>
-        <w:tc>
-          <w:tcPr/>
-          <w:p>
-            <w:pPr>
-              <w:pStyle w:val="Compact"/>
-              <w:jc w:val="left"/>
-            </w:pPr>
-            <w:r>
-              <w:t xml:space="preserve">$3.000.000</w:t>
-            </w:r>
-          </w:p>
-        </w:tc>
-      </w:tr>
-      <w:tr>
-        <w:tc>
-          <w:tcPr/>
-          <w:p>
-            <w:pPr>
-              <w:pStyle w:val="Compact"/>
-              <w:jc w:val="left"/>
-            </w:pPr>
-            <w:r>
-              <w:t xml:space="preserve">Subtotal aporte en dinero</w:t>
-            </w:r>
-          </w:p>
-        </w:tc>
-        <w:tc>
-          <w:tcPr/>
-          <w:p>
-            <w:pPr>
-              <w:pStyle w:val="Compact"/>
-              <w:jc w:val="left"/>
-            </w:pPr>
-            <w:r>
-              <w:t xml:space="preserve">$19.500.000</w:t>
-            </w:r>
-          </w:p>
-        </w:tc>
-      </w:tr>
-      <w:tr>
-        <w:tc>
-          <w:tcPr/>
-          <w:p>
-            <w:pPr>
-              <w:pStyle w:val="Compact"/>
-              <w:jc w:val="left"/>
-            </w:pPr>
-            <w:r>
-              <w:t xml:space="preserve">Dedicación del equipo de investigación de la Corporación al informe de dinámicas de violencia (en especie, valorada; actividad 2.7)</w:t>
-            </w:r>
-          </w:p>
-        </w:tc>
-        <w:tc>
-          <w:tcPr/>
-          <w:p>
-            <w:pPr>
-              <w:pStyle w:val="Compact"/>
-              <w:jc w:val="left"/>
-            </w:pPr>
-            <w:r>
-              <w:t xml:space="preserve">$12.000.000</w:t>
-            </w:r>
-          </w:p>
-        </w:tc>
-      </w:tr>
-      <w:tr>
-        <w:tc>
-          <w:tcPr/>
-          <w:p>
-            <w:pPr>
-              <w:pStyle w:val="Compact"/>
-              <w:jc w:val="left"/>
-            </w:pPr>
-            <w:r>
-              <w:t xml:space="preserve">Total del aporte de la Corporación (dinero más especie)</w:t>
-            </w:r>
-          </w:p>
-        </w:tc>
-        <w:tc>
-          <w:tcPr/>
-          <w:p>
-            <w:pPr>
-              <w:pStyle w:val="Compact"/>
-              <w:jc w:val="left"/>
-            </w:pPr>
-            <w:r>
-              <w:t xml:space="preserve">$31.500.000</w:t>
+              <w:t xml:space="preserve">$2.500.000</w:t>
+            </w:r>
+          </w:p>
+        </w:tc>
+      </w:tr>
+      <w:tr>
+        <w:tc>
+          <w:tcPr/>
+          <w:p>
+            <w:pPr>
+              <w:pStyle w:val="Compact"/>
+            </w:pPr>
+          </w:p>
+        </w:tc>
+        <w:tc>
+          <w:tcPr/>
+          <w:p>
+            <w:pPr>
+              <w:pStyle w:val="Compact"/>
+              <w:jc w:val="left"/>
+            </w:pPr>
+            <w:r>
+              <w:t xml:space="preserve">Imprevistos y contingencias, asumidos por la Corporación</w:t>
+            </w:r>
+          </w:p>
+        </w:tc>
+        <w:tc>
+          <w:tcPr/>
+          <w:p>
+            <w:pPr>
+              <w:pStyle w:val="Compact"/>
+              <w:jc w:val="left"/>
+            </w:pPr>
+            <w:r>
+              <w:t xml:space="preserve">$3.214.286</w:t>
+            </w:r>
+          </w:p>
+        </w:tc>
+      </w:tr>
+      <w:tr>
+        <w:tc>
+          <w:tcPr/>
+          <w:p>
+            <w:pPr>
+              <w:pStyle w:val="Compact"/>
+            </w:pPr>
+          </w:p>
+        </w:tc>
+        <w:tc>
+          <w:tcPr/>
+          <w:p>
+            <w:pPr>
+              <w:pStyle w:val="Compact"/>
+              <w:jc w:val="left"/>
+            </w:pPr>
+            <w:r>
+              <w:t xml:space="preserve">TOTAL APORTE DE LA CORPORACIÓN</w:t>
+            </w:r>
+          </w:p>
+        </w:tc>
+        <w:tc>
+          <w:tcPr/>
+          <w:p>
+            <w:pPr>
+              <w:pStyle w:val="Compact"/>
+              <w:jc w:val="left"/>
+            </w:pPr>
+            <w:r>
+              <w:t xml:space="preserve">$85.714.286</w:t>
             </w:r>
           </w:p>
         </w:tc>
@@ -7302,7 +7097,7 @@
         <w:pStyle w:val="BodyText"/>
       </w:pPr>
       <w:r>
-        <w:t xml:space="preserve">El peso del componente de litigio merece consignarse de manera expresa: los productos 4 y 5 suman $124.500.000, el 41,5 % del aporte departamental, y la partida individual de mayor cuantía del proyecto es la contratación de los servicios jurídicos especializados por $80.000.000, financiada íntegramente por la Gobernación. La contingencia del proyecto no se traslada al presupuesto departamental: la asume la Corporación con su aporte.</w:t>
+        <w:t xml:space="preserve">El peso del componente de litigio merece consignarse de manera expresa: los productos 4 y 5 suman $117.000.000, el 58,5 % del aporte departamental, y la partida individual de mayor cuantía del proyecto es la contratación de los servicios jurídicos especializados por $78.500.000 (el 27,5 % del valor total), financiada íntegramente por la Gobernación. Los costos indirectos de administración reconocidos entre ambas fuentes suman $13.500.000, el 4,7 % del valor total; el excedente lo asume la Corporación. La contingencia del proyecto no se traslada al presupuesto departamental: la asume la Corporación con su aporte.</w:t>
       </w:r>
     </w:p>
     <w:bookmarkEnd w:id="42"/>
@@ -8771,7 +8566,7 @@
         <w:pStyle w:val="BodyText"/>
       </w:pPr>
       <w:r>
-        <w:t xml:space="preserve">El equipo propio y el subcontrato de servicios jurídicos concentran juntos cerca del 61 % del valor total. Es la estructura esperable en un proyecto cuyo producto es conocimiento y actuación jurídica, no obra ni dotación. Solo la dirección general y las dos coordinaciones se fijan por encima del percentil 75 de la muestra, por la responsabilidad que asumen; el perfil que más se aparta es la dirección general, fijada en $6.500.000, que se sustenta en que el máximo observado para perfiles de coordinación en la muestra supera los doce millones mensuales y en que el cargo asume la representación del contrato, la responsabilidad técnica del informe y la supervisión del subcontrato.</w:t>
+        <w:t xml:space="preserve">El equipo propio y el subcontrato de servicios jurídicos concentran juntos el 67,8 % del valor total. Es la estructura esperable en un proyecto cuyo producto es conocimiento y actuación jurídica, no obra ni dotación. Solo la dirección general y las dos coordinaciones se fijan por encima del percentil 75 de la muestra, por la responsabilidad que asumen; el perfil que más se aparta es la dirección general, fijada en $6.500.000, que se sustenta en que el máximo observado para perfiles de coordinación en la muestra supera los doce millones mensuales y en que el cargo asume la representación del contrato, la responsabilidad técnica del informe y la supervisión del subcontrato.</w:t>
       </w:r>
     </w:p>
     <w:p>
@@ -8866,83 +8661,83 @@
               <w:jc w:val="left"/>
             </w:pPr>
             <w:r>
-              <w:t xml:space="preserve">$300.000.000</w:t>
-            </w:r>
-          </w:p>
-        </w:tc>
-        <w:tc>
-          <w:tcPr/>
-          <w:p>
-            <w:pPr>
-              <w:pStyle w:val="Compact"/>
-              <w:jc w:val="left"/>
-            </w:pPr>
-            <w:r>
-              <w:t xml:space="preserve">93,9 %</w:t>
-            </w:r>
-          </w:p>
-        </w:tc>
-      </w:tr>
-      <w:tr>
-        <w:tc>
-          <w:tcPr/>
-          <w:p>
-            <w:pPr>
-              <w:pStyle w:val="Compact"/>
-              <w:jc w:val="left"/>
-            </w:pPr>
-            <w:r>
-              <w:t xml:space="preserve">Corporación - recursos propios, en dinero, destinados a gastos menores de facilitación, imprevistos y complemento de los costos de administración</w:t>
-            </w:r>
-          </w:p>
-        </w:tc>
-        <w:tc>
-          <w:tcPr/>
-          <w:p>
-            <w:pPr>
-              <w:pStyle w:val="Compact"/>
-              <w:jc w:val="left"/>
-            </w:pPr>
-            <w:r>
-              <w:t xml:space="preserve">$19.500.000</w:t>
-            </w:r>
-          </w:p>
-        </w:tc>
-        <w:tc>
-          <w:tcPr/>
-          <w:p>
-            <w:pPr>
-              <w:pStyle w:val="Compact"/>
-              <w:jc w:val="left"/>
-            </w:pPr>
-            <w:r>
-              <w:t xml:space="preserve">6,1 %</w:t>
-            </w:r>
-          </w:p>
-        </w:tc>
-      </w:tr>
-      <w:tr>
-        <w:tc>
-          <w:tcPr/>
-          <w:p>
-            <w:pPr>
-              <w:pStyle w:val="Compact"/>
-              <w:jc w:val="left"/>
-            </w:pPr>
-            <w:r>
-              <w:t xml:space="preserve">VALOR TOTAL DEL CONTRATO EN DINERO</w:t>
-            </w:r>
-          </w:p>
-        </w:tc>
-        <w:tc>
-          <w:tcPr/>
-          <w:p>
-            <w:pPr>
-              <w:pStyle w:val="Compact"/>
-              <w:jc w:val="left"/>
-            </w:pPr>
-            <w:r>
-              <w:t xml:space="preserve">$319.500.000</w:t>
+              <w:t xml:space="preserve">$200.000.000</w:t>
+            </w:r>
+          </w:p>
+        </w:tc>
+        <w:tc>
+          <w:tcPr/>
+          <w:p>
+            <w:pPr>
+              <w:pStyle w:val="Compact"/>
+              <w:jc w:val="left"/>
+            </w:pPr>
+            <w:r>
+              <w:t xml:space="preserve">70,0 %</w:t>
+            </w:r>
+          </w:p>
+        </w:tc>
+      </w:tr>
+      <w:tr>
+        <w:tc>
+          <w:tcPr/>
+          <w:p>
+            <w:pPr>
+              <w:pStyle w:val="Compact"/>
+              <w:jc w:val="left"/>
+            </w:pPr>
+            <w:r>
+              <w:t xml:space="preserve">Corporación - recursos propios o de cooperación internacional, en dinero</w:t>
+            </w:r>
+          </w:p>
+        </w:tc>
+        <w:tc>
+          <w:tcPr/>
+          <w:p>
+            <w:pPr>
+              <w:pStyle w:val="Compact"/>
+              <w:jc w:val="left"/>
+            </w:pPr>
+            <w:r>
+              <w:t xml:space="preserve">$85.714.286</w:t>
+            </w:r>
+          </w:p>
+        </w:tc>
+        <w:tc>
+          <w:tcPr/>
+          <w:p>
+            <w:pPr>
+              <w:pStyle w:val="Compact"/>
+              <w:jc w:val="left"/>
+            </w:pPr>
+            <w:r>
+              <w:t xml:space="preserve">30,0 %</w:t>
+            </w:r>
+          </w:p>
+        </w:tc>
+      </w:tr>
+      <w:tr>
+        <w:tc>
+          <w:tcPr/>
+          <w:p>
+            <w:pPr>
+              <w:pStyle w:val="Compact"/>
+              <w:jc w:val="left"/>
+            </w:pPr>
+            <w:r>
+              <w:t xml:space="preserve">VALOR TOTAL DEL CONVENIO</w:t>
+            </w:r>
+          </w:p>
+        </w:tc>
+        <w:tc>
+          <w:tcPr/>
+          <w:p>
+            <w:pPr>
+              <w:pStyle w:val="Compact"/>
+              <w:jc w:val="left"/>
+            </w:pPr>
+            <w:r>
+              <w:t xml:space="preserve">$285.714.286</w:t>
             </w:r>
           </w:p>
         </w:tc>
@@ -8956,40 +8751,6 @@
             <w:r>
               <w:t xml:space="preserve">100 %</w:t>
             </w:r>
-          </w:p>
-        </w:tc>
-      </w:tr>
-      <w:tr>
-        <w:tc>
-          <w:tcPr/>
-          <w:p>
-            <w:pPr>
-              <w:pStyle w:val="Compact"/>
-              <w:jc w:val="left"/>
-            </w:pPr>
-            <w:r>
-              <w:t xml:space="preserve">Aporte adicional de la Corporación en especie (equipo de investigación dedicado al informe), valorado y declarado, que no computa en el valor en dinero</w:t>
-            </w:r>
-          </w:p>
-        </w:tc>
-        <w:tc>
-          <w:tcPr/>
-          <w:p>
-            <w:pPr>
-              <w:pStyle w:val="Compact"/>
-              <w:jc w:val="left"/>
-            </w:pPr>
-            <w:r>
-              <w:t xml:space="preserve">$12.000.000</w:t>
-            </w:r>
-          </w:p>
-        </w:tc>
-        <w:tc>
-          <w:tcPr/>
-          <w:p>
-            <w:pPr>
-              <w:pStyle w:val="Compact"/>
-            </w:pPr>
           </w:p>
         </w:tc>
       </w:tr>
@@ -8999,7 +8760,7 @@
         <w:pStyle w:val="BodyText"/>
       </w:pPr>
       <w:r>
-        <w:t xml:space="preserve">Modalidad recomendada: contrato de interés público del inciso 2 del artículo 355 de la Constitución, conforme a los artículos 1 a 4 del Decreto 092 de 2017. La decisión de que la Gobernación financie la totalidad del litigio estratégico y de que el aporte de la Corporación se limite a gastos menores de facilitación tiene una consecuencia contractual precisa: el convenio de asociación del artículo 96 de la Ley 489 de 1998 solo puede celebrarse de manera directa cuando la entidad sin ánimo de lucro compromete en dinero no menos del 30 % del valor total (artículo 5 del Decreto 092), umbral que esta estructura no alcanza ni pretende alcanzar. El contrato de interés público no exige ese piso. Exige, en cambio, la concurrencia de tres condiciones, todas satisfechas y que deben acreditarse en los estudios previos:</w:t>
+        <w:t xml:space="preserve">Modalidad: convenio de asociación del artículo 96 de la Ley 489 de 1998, celebrado de manera directa conforme al artículo 5 del Decreto 092 de 2017, que lo permite cuando la entidad sin ánimo de lucro compromete recursos en dinero por una proporción no inferior al 30 % del valor total del convenio.</w:t>
       </w:r>
     </w:p>
     <w:p>
@@ -9007,7 +8768,7 @@
         <w:pStyle w:val="BodyText"/>
       </w:pPr>
       <w:r>
-        <w:t xml:space="preserve">Que el objeto corresponda directamente a programas y actividades de interés público previstos en el plan de desarrollo, orientados a promover los derechos de personas en situación de debilidad manifiesta o el derecho a la paz. El numeral 2 acredita la correspondencia con once metas de la Apuesta 3.2.2 del Plan de Desarrollo «Norte, Territorio de Paz».</w:t>
+        <w:t xml:space="preserve">Una precisión aritmética que conviene dejar explícita: el 30 % se calcula sobre el valor total del convenio, no sobre el aporte de la Gobernación. Con $200.000.000 departamentales como el 70 %, el aporte de la Corporación es de $85.714.286 (200.000.000 multiplicado por 30 y dividido entre 70) y el valor total asciende a $285.714.286. Un aporte de $60.000.000 (el 30 % de 200 millones) representaría apenas el 23,1 % del valor total resultante y no habilitaría la celebración directa. Los aportes en especie no computan para el umbral, razón por la cual el aporte se pacta íntegramente en dinero, incluido el costo del equipo propio que la Corporación dedica al informe. Conforme a la doctrina de Colombia Compra Eficiente, esos recursos pueden ser propios o provenir de cooperación internacional.</w:t>
       </w:r>
     </w:p>
     <w:p>
@@ -9015,7 +8776,7 @@
         <w:pStyle w:val="BodyText"/>
       </w:pPr>
       <w:r>
-        <w:t xml:space="preserve">Que el contrato no comporte una relación conmutativa ni instrucciones precisas de la entidad al contratista. El informe, los boletines y las actuaciones jurídicas son bienes de interés general en favor de la población objetivo, no servicios prestados a la Gobernación; las cláusulas de autonomía técnica y editorial del numeral 9 materializan esta condición.</w:t>
+        <w:t xml:space="preserve">Tres reglas gobiernan el aporte y deben quedar en los estudios previos y en el clausulado:</w:t>
       </w:r>
     </w:p>
     <w:p>
@@ -9023,7 +8784,7 @@
         <w:pStyle w:val="BodyText"/>
       </w:pPr>
       <w:r>
-        <w:t xml:space="preserve">Que no exista oferta en el mercado distinta de la de las entidades sin ánimo de lucro, o que la contratación con ellas optimice recursos en términos de eficiencia, eficacia, economía y manejo del riesgo. La optimización se acredita con el aporte en dinero y en especie de la Corporación, su naturaleza de corporación de abogados que abarata la estrategia de recolección jurídica (numeral 7), y la ausencia de oferta mercantil comparable para un objeto que combina observatorio de derechos humanos, litigio ante el Sistema Interamericano y red de defensores.</w:t>
+        <w:t xml:space="preserve">La acreditación es previa. La Corporación debe acreditar los $85.714.286 al momento de radicar, mediante extractos, certificación de revisor fiscal o convenios de cooperación suscritos.</w:t>
       </w:r>
     </w:p>
     <w:p>
@@ -9031,7 +8792,228 @@
         <w:pStyle w:val="BodyText"/>
       </w:pPr>
       <w:r>
-        <w:t xml:space="preserve">La celebración directa exige además superar el filtro del artículo 4 del Decreto 092 de 2017: cuando en la etapa de planeación la entidad estatal identifique que el programa es ofrecido por más de una entidad sin ánimo de lucro de reconocida idoneidad, debe adelantar un proceso competitivo entre ellas. Los estudios previos deben descartar motivadamente esa pluralidad de oferentes: las organizaciones citadas como referentes metodológicos en el numeral 16 (Corporación Jurídica Libertad, Fundación Sumapaz, CINEP, Somos Defensores, FLIP) no ofrecen este programa en Norte de Santander ni tienen presencia operativa departamental para ejecutarlo en el plazo previsto; la verificación de que ninguna ESAL con asiento en el departamento ofrece un programa equivalente (observatorio, litigio ante el Sistema Interamericano y red departamental) debe documentarse en la planeación. Si el análisis identificara más de una oferente idónea, la ruta es el proceso competitivo del artículo 4, con el ajuste de cronograma que ello implica.</w:t>
+        <w:t xml:space="preserve">El ajuste es proporcional. Si el aporte de la Corporación varía, el valor total del convenio debe recalcularse como el aporte dividido entre 0,30 y el aporte departamental ajustarse en proporción; de lo contrario se pierde la habilitación para contratar directamente y la ruta pasa a ser el proceso competitivo.</w:t>
+      </w:r>
+    </w:p>
+    <w:p>
+      <w:pPr>
+        <w:pStyle w:val="BodyText"/>
+      </w:pPr>
+      <w:r>
+        <w:t xml:space="preserve">La pluralidad se resuelve con selección objetiva. Si más de una entidad sin ánimo de lucro ofreciera comprometer el 30 % en dinero para este programa, la Gobernación debe seleccionar de forma objetiva y justificar los criterios de la escogencia.</w:t>
+      </w:r>
+    </w:p>
+    <w:tbl>
+      <w:tblPr>
+        <w:tblStyle w:val="Table"/>
+        <w:tblW w:type="pct" w:w="5000"/>
+        <w:tblLook w:firstRow="1" w:lastRow="0" w:firstColumn="0" w:lastColumn="0" w:noHBand="0" w:noVBand="0" w:val="0020"/>
+        <w:jc w:val="start"/>
+      </w:tblPr>
+      <w:tblGrid>
+        <w:gridCol w:w="3960"/>
+        <w:gridCol w:w="3960"/>
+      </w:tblGrid>
+      <w:tr>
+        <w:trPr>
+          <w:tblHeader w:val="true"/>
+        </w:trPr>
+        <w:tc>
+          <w:tcPr/>
+          <w:p>
+            <w:pPr>
+              <w:pStyle w:val="Compact"/>
+              <w:jc w:val="left"/>
+            </w:pPr>
+            <w:r>
+              <w:t xml:space="preserve">Aplicación del aporte de la Corporación</w:t>
+            </w:r>
+          </w:p>
+        </w:tc>
+        <w:tc>
+          <w:tcPr/>
+          <w:p>
+            <w:pPr>
+              <w:pStyle w:val="Compact"/>
+              <w:jc w:val="left"/>
+            </w:pPr>
+            <w:r>
+              <w:t xml:space="preserve">Valor</w:t>
+            </w:r>
+          </w:p>
+        </w:tc>
+      </w:tr>
+      <w:tr>
+        <w:tc>
+          <w:tcPr/>
+          <w:p>
+            <w:pPr>
+              <w:pStyle w:val="Compact"/>
+              <w:jc w:val="left"/>
+            </w:pPr>
+            <w:r>
+              <w:t xml:space="preserve">Producto 1 - Sistema de información (modelo de datos, plataforma y alquiler de equipos cifrados)</w:t>
+            </w:r>
+          </w:p>
+        </w:tc>
+        <w:tc>
+          <w:tcPr/>
+          <w:p>
+            <w:pPr>
+              <w:pStyle w:val="Compact"/>
+              <w:jc w:val="left"/>
+            </w:pPr>
+            <w:r>
+              <w:t xml:space="preserve">$28.000.000</w:t>
+            </w:r>
+          </w:p>
+        </w:tc>
+      </w:tr>
+      <w:tr>
+        <w:tc>
+          <w:tcPr/>
+          <w:p>
+            <w:pPr>
+              <w:pStyle w:val="Compact"/>
+              <w:jc w:val="left"/>
+            </w:pPr>
+            <w:r>
+              <w:t xml:space="preserve">Producto 2 - Investigación del informe de dinámicas de violencia (coordinación del observatorio, enlaces territoriales, jornadas, peticiones, red de corresponsales y salas seguras)</w:t>
+            </w:r>
+          </w:p>
+        </w:tc>
+        <w:tc>
+          <w:tcPr/>
+          <w:p>
+            <w:pPr>
+              <w:pStyle w:val="Compact"/>
+              <w:jc w:val="left"/>
+            </w:pPr>
+            <w:r>
+              <w:t xml:space="preserve">$49.500.000</w:t>
+            </w:r>
+          </w:p>
+        </w:tc>
+      </w:tr>
+      <w:tr>
+        <w:tc>
+          <w:tcPr/>
+          <w:p>
+            <w:pPr>
+              <w:pStyle w:val="Compact"/>
+              <w:jc w:val="left"/>
+            </w:pPr>
+            <w:r>
+              <w:t xml:space="preserve">Facilitación de la ejecución: conectividad, telefonía segura y papelería</w:t>
+            </w:r>
+          </w:p>
+        </w:tc>
+        <w:tc>
+          <w:tcPr/>
+          <w:p>
+            <w:pPr>
+              <w:pStyle w:val="Compact"/>
+              <w:jc w:val="left"/>
+            </w:pPr>
+            <w:r>
+              <w:t xml:space="preserve">$2.500.000</w:t>
+            </w:r>
+          </w:p>
+        </w:tc>
+      </w:tr>
+      <w:tr>
+        <w:tc>
+          <w:tcPr/>
+          <w:p>
+            <w:pPr>
+              <w:pStyle w:val="Compact"/>
+              <w:jc w:val="left"/>
+            </w:pPr>
+            <w:r>
+              <w:t xml:space="preserve">Complemento de los costos indirectos de administración</w:t>
+            </w:r>
+          </w:p>
+        </w:tc>
+        <w:tc>
+          <w:tcPr/>
+          <w:p>
+            <w:pPr>
+              <w:pStyle w:val="Compact"/>
+              <w:jc w:val="left"/>
+            </w:pPr>
+            <w:r>
+              <w:t xml:space="preserve">$2.500.000</w:t>
+            </w:r>
+          </w:p>
+        </w:tc>
+      </w:tr>
+      <w:tr>
+        <w:tc>
+          <w:tcPr/>
+          <w:p>
+            <w:pPr>
+              <w:pStyle w:val="Compact"/>
+              <w:jc w:val="left"/>
+            </w:pPr>
+            <w:r>
+              <w:t xml:space="preserve">Imprevistos y contingencias del proyecto, asumidos por la Corporación</w:t>
+            </w:r>
+          </w:p>
+        </w:tc>
+        <w:tc>
+          <w:tcPr/>
+          <w:p>
+            <w:pPr>
+              <w:pStyle w:val="Compact"/>
+              <w:jc w:val="left"/>
+            </w:pPr>
+            <w:r>
+              <w:t xml:space="preserve">$3.214.286</w:t>
+            </w:r>
+          </w:p>
+        </w:tc>
+      </w:tr>
+      <w:tr>
+        <w:tc>
+          <w:tcPr/>
+          <w:p>
+            <w:pPr>
+              <w:pStyle w:val="Compact"/>
+              <w:jc w:val="left"/>
+            </w:pPr>
+            <w:r>
+              <w:t xml:space="preserve">Total del aporte en dinero de la Corporación</w:t>
+            </w:r>
+          </w:p>
+        </w:tc>
+        <w:tc>
+          <w:tcPr/>
+          <w:p>
+            <w:pPr>
+              <w:pStyle w:val="Compact"/>
+              <w:jc w:val="left"/>
+            </w:pPr>
+            <w:r>
+              <w:t xml:space="preserve">$85.714.286</w:t>
+            </w:r>
+          </w:p>
+        </w:tc>
+      </w:tr>
+    </w:tbl>
+    <w:p>
+      <w:pPr>
+        <w:pStyle w:val="BodyText"/>
+      </w:pPr>
+      <w:r>
+        <w:t xml:space="preserve">La consecuencia de esta aplicación merece subrayarse: la totalidad del componente de litigio estratégico, las rutas de protección, los boletines, la incidencia y la red de defensores se financia con el aporte de la Gobernación, y la totalidad del sistema de información y de la investigación del informe se financia y ejecuta con el aporte de la Corporación, que además asume la contingencia del proyecto. La contingencia no se traslada al presupuesto departamental.</w:t>
+      </w:r>
+    </w:p>
+    <w:p>
+      <w:pPr>
+        <w:pStyle w:val="BodyText"/>
+      </w:pPr>
+      <w:r>
+        <w:t xml:space="preserve">Sin relación conmutativa. También en el convenio de asociación el informe, los boletines y las actuaciones jurídicas se pactan como bienes de interés general en favor de la población objetivo, publicados y de acceso ciudadano, no como servicios prestados a la Gobernación; las cláusulas de autonomía técnica y editorial del numeral 9 lo materializan.</w:t>
       </w:r>
     </w:p>
     <w:p>
@@ -9047,7 +9029,7 @@
         <w:pStyle w:val="BodyText"/>
       </w:pPr>
       <w:r>
-        <w:t xml:space="preserve">Alternativa. Si la Gobernación prefiere la figura del convenio de asociación con celebración directa, la Corporación tendría que comprometer en dinero no menos del 30 % del valor total (con $300.000.000 de aporte departamental como 70 %, un aporte propio de $128.571.429). Esa alternativa queda documentada, pero no es la recomendada: contradice la decisión de estructura financiera de este proyecto, que concentra el aporte público en el litigio y deja a la Corporación los gastos menores de facilitación.</w:t>
+        <w:t xml:space="preserve">Vía subsidiaria. Si el aporte del 30 % no pudiera acreditarse al radicar, la alternativa documentada es el contrato de interés público del inciso 2 del artículo 355 de la Constitución (artículo 2 del Decreto 092), que no exige ese piso pero requiere acreditar sus tres condiciones y superar el filtro de pluralidad de oferentes del artículo 4 del mismo decreto, con el ajuste de cronograma que un proceso competitivo implicaría.</w:t>
       </w:r>
     </w:p>
     <w:bookmarkEnd w:id="44"/>
@@ -9568,7 +9550,7 @@
               <w:jc w:val="left"/>
             </w:pPr>
             <w:r>
-              <w:t xml:space="preserve">4</w:t>
+              <w:t xml:space="preserve">3</w:t>
             </w:r>
           </w:p>
         </w:tc>
@@ -9630,7 +9612,7 @@
               <w:jc w:val="left"/>
             </w:pPr>
             <w:r>
-              <w:t xml:space="preserve">4</w:t>
+              <w:t xml:space="preserve">3</w:t>
             </w:r>
           </w:p>
         </w:tc>
@@ -9957,19 +9939,19 @@
               <w:jc w:val="left"/>
             </w:pPr>
             <w:r>
-              <w:t xml:space="preserve">Encuentros subregionales de la red realizados</w:t>
-            </w:r>
-          </w:p>
-        </w:tc>
-        <w:tc>
-          <w:tcPr/>
-          <w:p>
-            <w:pPr>
-              <w:pStyle w:val="Compact"/>
-              <w:jc w:val="left"/>
-            </w:pPr>
-            <w:r>
-              <w:t xml:space="preserve">3</w:t>
+              <w:t xml:space="preserve">Jornadas territoriales con función de encuentro subregional de la red</w:t>
+            </w:r>
+          </w:p>
+        </w:tc>
+        <w:tc>
+          <w:tcPr/>
+          <w:p>
+            <w:pPr>
+              <w:pStyle w:val="Compact"/>
+              <w:jc w:val="left"/>
+            </w:pPr>
+            <w:r>
+              <w:t xml:space="preserve">5</w:t>
             </w:r>
           </w:p>
         </w:tc>
@@ -10297,7 +10279,7 @@
               <w:jc w:val="left"/>
             </w:pPr>
             <w:r>
-              <w:t xml:space="preserve">Insistencias y recursos frente a respuestas incompletas o negadas. Jornadas 3 y 4. Segundo taller de corresponsales en Ocaña y primer encuentro subregional de la red. Radicación del primer bloque de acciones jurídicas</w:t>
+              <w:t xml:space="preserve">Insistencias y recursos frente a respuestas incompletas o negadas. Jornadas 3 y 4, que cumplen también la función de encuentros subregionales de la red. Segundo taller de corresponsales en Ocaña. Radicación del primer bloque de acciones jurídicas</w:t>
             </w:r>
           </w:p>
         </w:tc>
@@ -10373,7 +10355,7 @@
               <w:jc w:val="left"/>
             </w:pPr>
             <w:r>
-              <w:t xml:space="preserve">Cierre de la base. Cálculo del índice de riesgo, del barómetro de impunidad y del mapa de brecha de protección. Preparación de las peticiones interamericanas. Segundo encuentro subregional de la red (Pamplona)</w:t>
+              <w:t xml:space="preserve">Cierre de la base. Cálculo del índice de riesgo, del barómetro de impunidad y del mapa de brecha de protección. Preparación de las peticiones interamericanas</w:t>
             </w:r>
           </w:p>
         </w:tc>
@@ -10449,7 +10431,7 @@
               <w:jc w:val="left"/>
             </w:pPr>
             <w:r>
-              <w:t xml:space="preserve">Ajuste del informe con las observaciones de la mesa. Radicación de las peticiones ante la Comisión Interamericana. Elaboración de los tres documentos de lineamientos técnicos. Tercer encuentro subregional de la red</w:t>
+              <w:t xml:space="preserve">Ajuste del informe con las observaciones de la mesa. Radicación de las peticiones ante la Comisión Interamericana. Elaboración de los tres documentos de lineamientos técnicos</w:t>
             </w:r>
           </w:p>
         </w:tc>
@@ -10487,7 +10469,7 @@
               <w:jc w:val="left"/>
             </w:pPr>
             <w:r>
-              <w:t xml:space="preserve">Audiencia pública de presentación ante la Asamblea, el Consejo Departamental de Paz y la Mesa Territorial de Garantías. Entrega al Subcomité de Prevención y a la CIPRAT. Segundo boletín estadístico impreso</w:t>
+              <w:t xml:space="preserve">Audiencia pública de presentación ante la Asamblea, el Consejo Departamental de Paz y la Mesa Territorial de Garantías. Entrega al Subcomité de Prevención y a la CIPRAT. Segundo boletín estadístico impreso. La audiencia sirve además de audiencia departamental de balance de la red</w:t>
             </w:r>
           </w:p>
         </w:tc>
@@ -10525,19 +10507,19 @@
               <w:jc w:val="left"/>
             </w:pPr>
             <w:r>
-              <w:t xml:space="preserve">Publicación definitiva, entrega de agregados anonimizados, audiencia departamental de balance de la red, auditoría externa, informe final y proyecto de acta de liquidación</w:t>
-            </w:r>
-          </w:p>
-        </w:tc>
-        <w:tc>
-          <w:tcPr/>
-          <w:p>
-            <w:pPr>
-              <w:pStyle w:val="Compact"/>
-              <w:jc w:val="left"/>
-            </w:pPr>
-            <w:r>
-              <w:t xml:space="preserve">Informe final entregado; audiencia de balance realizada</w:t>
+              <w:t xml:space="preserve">Publicación definitiva, entrega de agregados anonimizados, auditoría externa, informe final y proyecto de acta de liquidación</w:t>
+            </w:r>
+          </w:p>
+        </w:tc>
+        <w:tc>
+          <w:tcPr/>
+          <w:p>
+            <w:pPr>
+              <w:pStyle w:val="Compact"/>
+              <w:jc w:val="left"/>
+            </w:pPr>
+            <w:r>
+              <w:t xml:space="preserve">Informe final entregado</w:t>
             </w:r>
           </w:p>
         </w:tc>
@@ -10936,7 +10918,7 @@
               <w:jc w:val="left"/>
             </w:pPr>
             <w:r>
-              <w:t xml:space="preserve">Observación de los organismos de control a la celebración directa (artículos 2 y 4 del Decreto 092) o a la estructura de subcontratación</w:t>
+              <w:t xml:space="preserve">La Corporación no acredita el 30 % en dinero antes de suscribir</w:t>
             </w:r>
           </w:p>
         </w:tc>
@@ -10972,7 +10954,57 @@
               <w:jc w:val="left"/>
             </w:pPr>
             <w:r>
-              <w:t xml:space="preserve">Estudios previos que acrediten las tres condiciones del artículo 2, descarten motivadamente la pluralidad de oferentes del artículo 4 y sustenten la idoneidad de la Corporación; consulta escrita previa a Colombia Compra Eficiente (numerales 14.4 y 28); en subsidio, proceso competitivo entre ESAL o convenio de asociación con aporte del 30 %</w:t>
+              <w:t xml:space="preserve">Certificación previa a la radicación (extractos, revisor fiscal o convenios de cooperación); regla de ajuste proporcional del numeral 20; en subsidio, proceso competitivo o contrato de interés público del artículo 2 con el análisis del artículo 4 del Decreto 092</w:t>
+            </w:r>
+          </w:p>
+        </w:tc>
+      </w:tr>
+      <w:tr>
+        <w:tc>
+          <w:tcPr/>
+          <w:p>
+            <w:pPr>
+              <w:pStyle w:val="Compact"/>
+              <w:jc w:val="left"/>
+            </w:pPr>
+            <w:r>
+              <w:t xml:space="preserve">Observación de los organismos de control a la estructura de subcontratación financiada con recursos públicos</w:t>
+            </w:r>
+          </w:p>
+        </w:tc>
+        <w:tc>
+          <w:tcPr/>
+          <w:p>
+            <w:pPr>
+              <w:pStyle w:val="Compact"/>
+              <w:jc w:val="left"/>
+            </w:pPr>
+            <w:r>
+              <w:t xml:space="preserve">Media</w:t>
+            </w:r>
+          </w:p>
+        </w:tc>
+        <w:tc>
+          <w:tcPr/>
+          <w:p>
+            <w:pPr>
+              <w:pStyle w:val="Compact"/>
+              <w:jc w:val="left"/>
+            </w:pPr>
+            <w:r>
+              <w:t xml:space="preserve">Alto</w:t>
+            </w:r>
+          </w:p>
+        </w:tc>
+        <w:tc>
+          <w:tcPr/>
+          <w:p>
+            <w:pPr>
+              <w:pStyle w:val="Compact"/>
+              <w:jc w:val="left"/>
+            </w:pPr>
+            <w:r>
+              <w:t xml:space="preserve">Análisis del numeral 14.4; consulta escrita previa a Colombia Compra Eficiente (numerales 14.4 y 28); pago del subcontrato contra entregables aprobados</w:t>
             </w:r>
           </w:p>
         </w:tc>
@@ -11554,7 +11586,7 @@
               <w:jc w:val="left"/>
             </w:pPr>
             <w:r>
-              <w:t xml:space="preserve">Fase 1</w:t>
+              <w:t xml:space="preserve">Fase 2</w:t>
             </w:r>
           </w:p>
         </w:tc>
@@ -12405,19 +12437,19 @@
               <w:jc w:val="left"/>
             </w:pPr>
             <w:r>
-              <w:t xml:space="preserve">Subcontrato de $80.000.000 y componente jurídico completo ($124.500.000) financiados íntegramente por la Gobernación</w:t>
-            </w:r>
-          </w:p>
-        </w:tc>
-        <w:tc>
-          <w:tcPr/>
-          <w:p>
-            <w:pPr>
-              <w:pStyle w:val="Compact"/>
-              <w:jc w:val="left"/>
-            </w:pPr>
-            <w:r>
-              <w:t xml:space="preserve">El aporte público se concentra en el componente central del proyecto; la estructura exige cambiar la modalidad de contratación</w:t>
+              <w:t xml:space="preserve">El mismo subcontrato de $78.500.000 y el componente jurídico completo ($117.000.000) financiados íntegramente por la Gobernación</w:t>
+            </w:r>
+          </w:p>
+        </w:tc>
+        <w:tc>
+          <w:tcPr/>
+          <w:p>
+            <w:pPr>
+              <w:pStyle w:val="Compact"/>
+              <w:jc w:val="left"/>
+            </w:pPr>
+            <w:r>
+              <w:t xml:space="preserve">El aporte público se concentra en el componente central del proyecto</w:t>
             </w:r>
           </w:p>
         </w:tc>
@@ -12443,31 +12475,31 @@
               <w:jc w:val="left"/>
             </w:pPr>
             <w:r>
-              <w:t xml:space="preserve">$85.714.286 en dinero (30 % del valor total), aplicados al subcontrato y a imprevistos</w:t>
-            </w:r>
-          </w:p>
-        </w:tc>
-        <w:tc>
-          <w:tcPr/>
-          <w:p>
-            <w:pPr>
-              <w:pStyle w:val="Compact"/>
-              <w:jc w:val="left"/>
-            </w:pPr>
-            <w:r>
-              <w:t xml:space="preserve">$19.500.000 en dinero para gastos menores de facilitación, imprevistos y complemento de los costos de administración, más $12.000.000 en especie (equipo de investigación dedicado al informe)</w:t>
-            </w:r>
-          </w:p>
-        </w:tc>
-        <w:tc>
-          <w:tcPr/>
-          <w:p>
-            <w:pPr>
-              <w:pStyle w:val="Compact"/>
-              <w:jc w:val="left"/>
-            </w:pPr>
-            <w:r>
-              <w:t xml:space="preserve">La Corporación facilita la ejecución y aporta trabajo al informe; deja de cargar con la partida mayor</w:t>
+              <w:t xml:space="preserve">$85.714.286 en dinero (30 % del valor total), aplicados al subcontrato de litigio y a imprevistos</w:t>
+            </w:r>
+          </w:p>
+        </w:tc>
+        <w:tc>
+          <w:tcPr/>
+          <w:p>
+            <w:pPr>
+              <w:pStyle w:val="Compact"/>
+              <w:jc w:val="left"/>
+            </w:pPr>
+            <w:r>
+              <w:t xml:space="preserve">$85.714.286 en dinero (30 % del valor total), aplicados al sistema de información, a la investigación del informe, a la facilitación y a los imprevistos</w:t>
+            </w:r>
+          </w:p>
+        </w:tc>
+        <w:tc>
+          <w:tcPr/>
+          <w:p>
+            <w:pPr>
+              <w:pStyle w:val="Compact"/>
+              <w:jc w:val="left"/>
+            </w:pPr>
+            <w:r>
+              <w:t xml:space="preserve">Se conservan el monto y el porcentaje que habilitan la celebración directa; cambia su aplicación: la Corporación financia y ejecuta la producción del informe y deja de cargar con el litigio</w:t>
             </w:r>
           </w:p>
         </w:tc>
@@ -12505,19 +12537,19 @@
               <w:jc w:val="left"/>
             </w:pPr>
             <w:r>
-              <w:t xml:space="preserve">Contrato de interés público (artículo 355 de la Constitución y artículo 2 del Decreto 092 de 2017), que no exige el piso del 30 %</w:t>
-            </w:r>
-          </w:p>
-        </w:tc>
-        <w:tc>
-          <w:tcPr/>
-          <w:p>
-            <w:pPr>
-              <w:pStyle w:val="Compact"/>
-              <w:jc w:val="left"/>
-            </w:pPr>
-            <w:r>
-              <w:t xml:space="preserve">Mantiene la celebración directa con la nueva estructura financiera; exige acreditar las tres condiciones del artículo 2 en los estudios previos</w:t>
+              <w:t xml:space="preserve">Se mantiene la misma modalidad y el mismo aporte del 30 %; solo cambia su aplicación (del litigio al observatorio)</w:t>
+            </w:r>
+          </w:p>
+        </w:tc>
+        <w:tc>
+          <w:tcPr/>
+          <w:p>
+            <w:pPr>
+              <w:pStyle w:val="Compact"/>
+              <w:jc w:val="left"/>
+            </w:pPr>
+            <w:r>
+              <w:t xml:space="preserve">La celebración directa no se altera; el contrato de interés público del artículo 2 queda documentado únicamente como vía subsidiaria</w:t>
             </w:r>
           </w:p>
         </w:tc>
@@ -12555,19 +12587,19 @@
               <w:jc w:val="left"/>
             </w:pPr>
             <w:r>
-              <w:t xml:space="preserve">$319.500.000 en dinero; $300.000.000 de la Gobernación</w:t>
-            </w:r>
-          </w:p>
-        </w:tc>
-        <w:tc>
-          <w:tcPr/>
-          <w:p>
-            <w:pPr>
-              <w:pStyle w:val="Compact"/>
-              <w:jc w:val="left"/>
-            </w:pPr>
-            <w:r>
-              <w:t xml:space="preserve">Requiere ajustar el CDP y la disponibilidad de la vigencia 2026</w:t>
+              <w:t xml:space="preserve">Sin cambio: $285.714.286 totales; $200.000.000 de la Gobernación y $85.714.286 de la Corporación</w:t>
+            </w:r>
+          </w:p>
+        </w:tc>
+        <w:tc>
+          <w:tcPr/>
+          <w:p>
+            <w:pPr>
+              <w:pStyle w:val="Compact"/>
+              <w:jc w:val="left"/>
+            </w:pPr>
+            <w:r>
+              <w:t xml:space="preserve">El CDP y la disponibilidad de la vigencia 2026 se mantienen en los valores ya previstos</w:t>
             </w:r>
           </w:p>
         </w:tc>
@@ -12605,7 +12637,7 @@
               <w:jc w:val="left"/>
             </w:pPr>
             <w:r>
-              <w:t xml:space="preserve">10 boletines semanales digitales y 2 impresos</w:t>
+              <w:t xml:space="preserve">10 boletines semanales digitales y 2 impresos, con el mismo presupuesto del producto (el costo es principalmente el trabajo del analista, ya financiado)</w:t>
             </w:r>
           </w:p>
         </w:tc>
@@ -12655,19 +12687,19 @@
               <w:jc w:val="left"/>
             </w:pPr>
             <w:r>
-              <w:t xml:space="preserve">4 peticiones, 4 solicitudes de medidas cautelares (al menos una colectiva) y 3 comunicaciones a la ONU; se suprime el indicador de rutas de atención (la ruta pertenece al programa departamental existente, meta 760) y el indicador del Producto 5 se verifica con expedientes y actuaciones radicadas</w:t>
-            </w:r>
-          </w:p>
-        </w:tc>
-        <w:tc>
-          <w:tcPr/>
-          <w:p>
-            <w:pPr>
-              <w:pStyle w:val="Compact"/>
-              <w:jc w:val="left"/>
-            </w:pPr>
-            <w:r>
-              <w:t xml:space="preserve">Eleva el nivel del componente central y formula todas las metas como actuaciones radicadas, no como decisiones de terceros</w:t>
+              <w:t xml:space="preserve">Se mantienen 3 peticiones, 3 solicitudes de medidas cautelares (ahora con al menos una colectiva exigida) y 2 comunicaciones a la ONU, financiadas con el aporte público; se suprime el indicador de rutas de atención (la ruta pertenece al programa departamental existente, meta 760) y el indicador del Producto 5 se verifica con expedientes y actuaciones radicadas</w:t>
+            </w:r>
+          </w:p>
+        </w:tc>
+        <w:tc>
+          <w:tcPr/>
+          <w:p>
+            <w:pPr>
+              <w:pStyle w:val="Compact"/>
+              <w:jc w:val="left"/>
+            </w:pPr>
+            <w:r>
+              <w:t xml:space="preserve">El nivel se eleva por la vía de la financiación pública y del compromiso expreso de llegar a la CIDH; las metas se formulan como actuaciones radicadas</w:t>
             </w:r>
           </w:p>
         </w:tc>
@@ -12705,19 +12737,19 @@
               <w:jc w:val="left"/>
             </w:pPr>
             <w:r>
-              <w:t xml:space="preserve">Red departamental de defensores como componente propio (Producto 7), que integra la red de corresponsales, con protocolo de alerta entre pares, guía de autoprotección, instalación pública y audiencia de balance</w:t>
-            </w:r>
-          </w:p>
-        </w:tc>
-        <w:tc>
-          <w:tcPr/>
-          <w:p>
-            <w:pPr>
-              <w:pStyle w:val="Compact"/>
-              <w:jc w:val="left"/>
-            </w:pPr>
-            <w:r>
-              <w:t xml:space="preserve">Materializa las metas 749, 760, 761 y 764; crea el activo de sostenibilidad y la destinataria de las medidas cautelares colectivas</w:t>
+              <w:t xml:space="preserve">Red departamental de defensores como componente propio (Producto 7), que integra la red de corresponsales, con protocolo de alerta entre pares, guía de autoprotección e instalación pública; sus encuentros subregionales se realizan en las jornadas territoriales y su audiencia de balance en la audiencia pública, para no duplicar costos</w:t>
+            </w:r>
+          </w:p>
+        </w:tc>
+        <w:tc>
+          <w:tcPr/>
+          <w:p>
+            <w:pPr>
+              <w:pStyle w:val="Compact"/>
+              <w:jc w:val="left"/>
+            </w:pPr>
+            <w:r>
+              <w:t xml:space="preserve">Materializa las metas 749, 760, 761 y 764 sin ampliar el presupuesto; crea el activo de sostenibilidad y la destinataria de las medidas cautelares colectivas</w:t>
             </w:r>
           </w:p>
         </w:tc>
@@ -12933,7 +12965,7 @@
               <w:jc w:val="left"/>
             </w:pPr>
             <w:r>
-              <w:t xml:space="preserve">Concepto de la oficina jurídica de la Gobernación sobre la modalidad del contrato de interés público (artículo 2 del Decreto 092 de 2017) para esta estructura financiera, y consulta escrita a la ANCP - Colombia Compra Eficiente sobre la modalidad y la estructura de subcontratación, anexada a los estudios previos</w:t>
+              <w:t xml:space="preserve">Acreditar en dinero los $85.714.286 del aporte de la Corporación al momento de radicar (extractos, certificación de revisor fiscal o convenios de cooperación suscritos); si el aporte varía, aplicar la regla de ajuste proporcional del numeral 20</w:t>
             </w:r>
           </w:p>
         </w:tc>
@@ -13047,7 +13079,7 @@
               <w:jc w:val="left"/>
             </w:pPr>
             <w:r>
-              <w:t xml:space="preserve">Confirmar rubro, fuente y expedición del CDP por $300.000.000 dentro de la vigencia 2026</w:t>
+              <w:t xml:space="preserve">Confirmar rubro, fuente y expedición del CDP por $200.000.000 dentro de la vigencia 2026</w:t>
             </w:r>
           </w:p>
         </w:tc>
@@ -13085,19 +13117,19 @@
               <w:jc w:val="left"/>
             </w:pPr>
             <w:r>
-              <w:t xml:space="preserve">Certificar el aporte de la Corporación: $19.500.000 en dinero (extractos o certificación de revisor fiscal) y la valoración del aporte en especie</w:t>
-            </w:r>
-          </w:p>
-        </w:tc>
-        <w:tc>
-          <w:tcPr/>
-          <w:p>
-            <w:pPr>
-              <w:pStyle w:val="Compact"/>
-              <w:jc w:val="left"/>
-            </w:pPr>
-            <w:r>
-              <w:t xml:space="preserve">Viabilidad</w:t>
+              <w:t xml:space="preserve">Elevar consulta escrita a la ANCP - Colombia Compra Eficiente sobre la admisibilidad de la estructura de subcontratación del numeral 14, financiada con recursos públicos, y anexar la respuesta a los estudios previos</w:t>
+            </w:r>
+          </w:p>
+        </w:tc>
+        <w:tc>
+          <w:tcPr/>
+          <w:p>
+            <w:pPr>
+              <w:pStyle w:val="Compact"/>
+              <w:jc w:val="left"/>
+            </w:pPr>
+            <w:r>
+              <w:t xml:space="preserve">Alta</w:t>
             </w:r>
           </w:p>
         </w:tc>
@@ -13498,7 +13530,7 @@
         <w:pStyle w:val="FirstParagraph"/>
       </w:pPr>
       <w:r>
-        <w:t xml:space="preserve">El proyecto que resulta de esta integración concentra el aporte público donde está su valor: el litigio estratégico. La Gobernación financia la totalidad del componente jurídico, incluida la firma especializada que llevará los casos emblemáticos ante la Comisión Interamericana de Derechos Humanos, y la Corporación facilita la ejecución con gastos menores y aporta su equipo de investigación al informe. El observatorio produce la evidencia que ninguna entidad puede producir sobre sí misma; los boletines semanales la mantienen viva durante la ejecución; y la red departamental de defensores garantiza que, al terminar la fase, quede instalada una capacidad colectiva de documentación, alerta y exigencia que no depende de un inmueble ni de un solo actor. El componente jurídico asegura que la documentación no se agote en el diagnóstico: cada caso documentado se traduce en una actuación ante la autoridad competente y, en los casos emblemáticos, ante el Sistema Interamericano.</w:t>
+        <w:t xml:space="preserve">El proyecto que resulta de esta integración concentra el aporte público donde está su valor: el litigio estratégico. La Gobernación financia la totalidad del componente jurídico, incluida la firma especializada que llevará los casos emblemáticos ante la Comisión Interamericana de Derechos Humanos, y la Corporación, con su aporte en dinero del 30 % del valor total, financia y ejecuta el sistema de información y la investigación del informe, facilita la ejecución y asume los imprevistos. El observatorio produce la evidencia que ninguna entidad puede producir sobre sí misma; los boletines semanales la mantienen viva durante la ejecución; y la red departamental de defensores garantiza que, al terminar la fase, quede instalada una capacidad colectiva de documentación, alerta y exigencia que no depende de un inmueble ni de un solo actor. El componente jurídico asegura que la documentación no se agote en el diagnóstico: cada caso documentado se traduce en una actuación ante la autoridad competente y, en los casos emblemáticos, ante el Sistema Interamericano.</w:t>
       </w:r>
     </w:p>
     <w:bookmarkEnd w:id="54"/>

</xml_diff>